<commit_message>
Replace v5 Figure 2 with paired estimation plot
</commit_message>
<xml_diff>
--- a/word_output/2026.09.20v5.docx
+++ b/word_output/2026.09.20v5.docx
@@ -13249,357 +13249,307 @@
           <w:color w:val="000000"/>
           <w:szCs w:val="21"/>
         </w:rPr>
-        <w:t>同种子配对结果见图</w:t>
-      </w:r>
-      <w:r>
-        <w:rPr>
-          <w:color w:val="000000"/>
-          <w:szCs w:val="21"/>
-        </w:rPr>
-        <w:t>2</w:t>
-      </w:r>
-      <w:r>
-        <w:rPr>
-          <w:color w:val="000000"/>
-          <w:szCs w:val="21"/>
-        </w:rPr>
-        <w:t>。</w:t>
-      </w:r>
-      <w:r>
-        <w:rPr>
-          <w:color w:val="000000"/>
-          <w:szCs w:val="21"/>
-        </w:rPr>
-        <w:t>Abilene</w:t>
-      </w:r>
-      <w:r>
-        <w:rPr>
-          <w:color w:val="000000"/>
-          <w:szCs w:val="21"/>
-        </w:rPr>
-        <w:t>中，自适应模型相对固定等权模型在</w:t>
-      </w:r>
-      <w:r>
-        <w:rPr>
-          <w:color w:val="000000"/>
-          <w:szCs w:val="21"/>
-        </w:rPr>
-        <w:t>8</w:t>
-      </w:r>
-      <w:r>
-        <w:rPr>
-          <w:color w:val="000000"/>
-          <w:szCs w:val="21"/>
-        </w:rPr>
-        <w:t>个种子中的</w:t>
-      </w:r>
-      <w:r>
-        <w:rPr>
-          <w:color w:val="000000"/>
-          <w:szCs w:val="21"/>
-        </w:rPr>
-        <w:t>6</w:t>
-      </w:r>
-      <w:r>
-        <w:rPr>
-          <w:color w:val="000000"/>
-          <w:szCs w:val="21"/>
-        </w:rPr>
-        <w:t>个取得更低</w:t>
-      </w:r>
-      <w:r>
-        <w:rPr>
-          <w:color w:val="000000"/>
-          <w:szCs w:val="21"/>
-        </w:rPr>
-        <w:t>MSE</w:t>
-      </w:r>
-      <w:r>
-        <w:rPr>
-          <w:color w:val="000000"/>
-          <w:szCs w:val="21"/>
-        </w:rPr>
-        <w:t>；</w:t>
-      </w:r>
-      <w:r>
-        <w:rPr>
-          <w:color w:val="000000"/>
-          <w:szCs w:val="21"/>
-        </w:rPr>
-        <w:t>GÉANT</w:t>
-      </w:r>
-      <w:r>
-        <w:rPr>
-          <w:color w:val="000000"/>
-          <w:szCs w:val="21"/>
-        </w:rPr>
-        <w:t>中为</w:t>
-      </w:r>
-      <w:r>
-        <w:rPr>
-          <w:color w:val="000000"/>
-          <w:szCs w:val="21"/>
-        </w:rPr>
-        <w:t>7</w:t>
-      </w:r>
-      <w:r>
-        <w:rPr>
-          <w:color w:val="000000"/>
-          <w:szCs w:val="21"/>
-        </w:rPr>
-        <w:t>个。</w:t>
-      </w:r>
-      <w:r>
-        <w:rPr>
-          <w:color w:val="000000"/>
-          <w:szCs w:val="21"/>
-        </w:rPr>
-        <w:t>Abilene</w:t>
-      </w:r>
-      <w:r>
-        <w:rPr>
-          <w:color w:val="000000"/>
-          <w:szCs w:val="21"/>
-        </w:rPr>
-        <w:t>上，自适应模型相对</w:t>
-      </w:r>
-      <w:r>
-        <w:rPr>
-          <w:color w:val="000000"/>
-          <w:szCs w:val="21"/>
-        </w:rPr>
-        <w:t>DLinear</w:t>
-      </w:r>
-      <w:r>
-        <w:rPr>
-          <w:color w:val="000000"/>
-          <w:szCs w:val="21"/>
-        </w:rPr>
-        <w:t>的</w:t>
-      </w:r>
-      <w:r>
-        <w:rPr>
-          <w:color w:val="000000"/>
-          <w:szCs w:val="21"/>
-        </w:rPr>
-        <w:t>MSE</w:t>
-      </w:r>
-      <w:r>
-        <w:rPr>
-          <w:color w:val="000000"/>
-          <w:szCs w:val="21"/>
-        </w:rPr>
-        <w:t>平均配对差为</w:t>
-      </w:r>
-      <w:r>
-        <w:rPr>
-          <w:color w:val="000000"/>
-          <w:szCs w:val="21"/>
-        </w:rPr>
-        <w:t>0.00537</w:t>
-      </w:r>
-      <w:r>
-        <w:rPr>
-          <w:color w:val="000000"/>
-          <w:szCs w:val="21"/>
-        </w:rPr>
-        <w:t>，</w:t>
-      </w:r>
-      <w:r>
-        <w:rPr>
-          <w:color w:val="000000"/>
-          <w:szCs w:val="21"/>
-        </w:rPr>
-        <w:t>95%</w:t>
-      </w:r>
-      <w:r>
-        <w:rPr>
-          <w:color w:val="000000"/>
-          <w:szCs w:val="21"/>
-        </w:rPr>
-        <w:t>置信区间为</w:t>
-      </w:r>
-      <w:r>
-        <w:rPr>
-          <w:color w:val="000000"/>
-          <w:szCs w:val="21"/>
-        </w:rPr>
-        <w:t>[0.00338,0.00736]</w:t>
-      </w:r>
-      <w:r>
-        <w:rPr>
-          <w:color w:val="000000"/>
-          <w:szCs w:val="21"/>
-        </w:rPr>
-        <w:t>，</w:t>
-      </w:r>
-      <w:r>
-        <w:rPr>
-          <w:color w:val="000000"/>
-          <w:szCs w:val="21"/>
-        </w:rPr>
-        <w:t>p&lt;0.001</w:t>
-      </w:r>
-      <w:r>
-        <w:rPr>
-          <w:color w:val="000000"/>
-          <w:szCs w:val="21"/>
-        </w:rPr>
-        <w:t>；相对固定等权模型的</w:t>
-      </w:r>
-      <w:r>
-        <w:rPr>
-          <w:color w:val="000000"/>
-          <w:szCs w:val="21"/>
-        </w:rPr>
-        <w:t>MSE</w:t>
-      </w:r>
-      <w:r>
-        <w:rPr>
-          <w:color w:val="000000"/>
-          <w:szCs w:val="21"/>
-        </w:rPr>
-        <w:t>差异</w:t>
-      </w:r>
-      <w:r>
-        <w:rPr>
-          <w:color w:val="000000"/>
-          <w:szCs w:val="21"/>
-        </w:rPr>
-        <w:t>p=0.061</w:t>
-      </w:r>
-      <w:r>
-        <w:rPr>
-          <w:color w:val="000000"/>
-          <w:szCs w:val="21"/>
-        </w:rPr>
-        <w:t>，而</w:t>
-      </w:r>
-      <w:r>
-        <w:rPr>
-          <w:color w:val="000000"/>
-          <w:szCs w:val="21"/>
-        </w:rPr>
-        <w:t>MAE</w:t>
-      </w:r>
-      <w:r>
-        <w:rPr>
-          <w:color w:val="000000"/>
-          <w:szCs w:val="21"/>
-        </w:rPr>
-        <w:t>差异</w:t>
-      </w:r>
-      <w:r>
-        <w:rPr>
-          <w:color w:val="000000"/>
-          <w:szCs w:val="21"/>
-        </w:rPr>
-        <w:t>p=0.004</w:t>
-      </w:r>
-      <w:r>
-        <w:rPr>
-          <w:color w:val="000000"/>
-          <w:szCs w:val="21"/>
-        </w:rPr>
-        <w:t>。</w:t>
-      </w:r>
-      <w:r>
-        <w:rPr>
-          <w:color w:val="000000"/>
-          <w:szCs w:val="21"/>
-        </w:rPr>
-        <w:t>GÉANT</w:t>
-      </w:r>
-      <w:r>
-        <w:rPr>
-          <w:color w:val="000000"/>
-          <w:szCs w:val="21"/>
-        </w:rPr>
-        <w:t>上，自适应模型相对</w:t>
-      </w:r>
-      <w:r>
-        <w:rPr>
-          <w:color w:val="000000"/>
-          <w:szCs w:val="21"/>
-        </w:rPr>
-        <w:t>DLinear</w:t>
-      </w:r>
-      <w:r>
-        <w:rPr>
-          <w:color w:val="000000"/>
-          <w:szCs w:val="21"/>
-        </w:rPr>
-        <w:t>和固定等权模型的</w:t>
-      </w:r>
-      <w:r>
-        <w:rPr>
-          <w:color w:val="000000"/>
-          <w:szCs w:val="21"/>
-        </w:rPr>
-        <w:t>MSE</w:t>
-      </w:r>
-      <w:r>
-        <w:rPr>
-          <w:color w:val="000000"/>
-          <w:szCs w:val="21"/>
-        </w:rPr>
-        <w:t>配对检验</w:t>
-      </w:r>
-      <w:r>
-        <w:rPr>
-          <w:color w:val="000000"/>
-          <w:szCs w:val="21"/>
-        </w:rPr>
-        <w:t>p</w:t>
-      </w:r>
-      <w:r>
-        <w:rPr>
-          <w:color w:val="000000"/>
-          <w:szCs w:val="21"/>
-        </w:rPr>
-        <w:t>值分别为</w:t>
-      </w:r>
-      <w:r>
-        <w:rPr>
-          <w:color w:val="000000"/>
-          <w:szCs w:val="21"/>
-        </w:rPr>
-        <w:t>0.305</w:t>
-      </w:r>
-      <w:r>
-        <w:rPr>
-          <w:color w:val="000000"/>
-          <w:szCs w:val="21"/>
-        </w:rPr>
-        <w:t>和</w:t>
-      </w:r>
-      <w:r>
-        <w:rPr>
-          <w:color w:val="000000"/>
-          <w:szCs w:val="21"/>
-        </w:rPr>
-        <w:t>0.149</w:t>
-      </w:r>
-      <w:r>
-        <w:rPr>
-          <w:color w:val="000000"/>
-          <w:szCs w:val="21"/>
-        </w:rPr>
-        <w:t>。因此，两个数据集的平均误差方向均支持自适应加权，但不能表述为所有随机种子均提升；尤其</w:t>
-      </w:r>
-      <w:r>
-        <w:rPr>
-          <w:color w:val="000000"/>
-          <w:szCs w:val="21"/>
-        </w:rPr>
-        <w:t>GÉANT</w:t>
-      </w:r>
-      <w:r>
-        <w:rPr>
-          <w:color w:val="000000"/>
-          <w:szCs w:val="21"/>
-        </w:rPr>
-        <w:t>仍存在较明显的跨种子波动。</w:t>
+        <w:t>同种子配对结果及配对差值分布见图2。图2上排保留随机种子42—49的逐一配对MSE，下排以ΔMSE=固定等权−自适应权重表示效应方向。Abilene中，自适应模型在8个种子中的6个取得更低MSE，平均ΔMSE为0.00320，95%置信区间为[-0.00020,0.00660]，配对t检验p=0.061；GÉANT中为7个，平均ΔMSE为0.02094，95%置信区间为[-0.00958,0.05146]，p=0.149。两数据集的平均差值均为正，说明样本级自适应加权在平均意义上降低了MSE；但相对固定等权的95%置信区间均跨越0，因此不能表述为两数据集均达到统计显著。结合表3可见，Abilene上的跨种子波动较小，而GÉANT仍存在更明显的稳定性提升空间。</w:t>
+      </w:r>
+      <w:r>
+        <w:rPr>
+          <w:color w:val="000000"/>
+          <w:szCs w:val="21"/>
+        </w:rPr>
+      </w:r>
+      <w:r>
+        <w:rPr>
+          <w:color w:val="000000"/>
+          <w:szCs w:val="21"/>
+        </w:rPr>
+      </w:r>
+      <w:r>
+        <w:rPr>
+          <w:color w:val="000000"/>
+          <w:szCs w:val="21"/>
+        </w:rPr>
+      </w:r>
+      <w:r>
+        <w:rPr>
+          <w:color w:val="000000"/>
+          <w:szCs w:val="21"/>
+        </w:rPr>
+      </w:r>
+      <w:r>
+        <w:rPr>
+          <w:color w:val="000000"/>
+          <w:szCs w:val="21"/>
+        </w:rPr>
+      </w:r>
+      <w:r>
+        <w:rPr>
+          <w:color w:val="000000"/>
+          <w:szCs w:val="21"/>
+        </w:rPr>
+      </w:r>
+      <w:r>
+        <w:rPr>
+          <w:color w:val="000000"/>
+          <w:szCs w:val="21"/>
+        </w:rPr>
+      </w:r>
+      <w:r>
+        <w:rPr>
+          <w:color w:val="000000"/>
+          <w:szCs w:val="21"/>
+        </w:rPr>
+      </w:r>
+      <w:r>
+        <w:rPr>
+          <w:color w:val="000000"/>
+          <w:szCs w:val="21"/>
+        </w:rPr>
+      </w:r>
+      <w:r>
+        <w:rPr>
+          <w:color w:val="000000"/>
+          <w:szCs w:val="21"/>
+        </w:rPr>
+      </w:r>
+      <w:r>
+        <w:rPr>
+          <w:color w:val="000000"/>
+          <w:szCs w:val="21"/>
+        </w:rPr>
+      </w:r>
+      <w:r>
+        <w:rPr>
+          <w:color w:val="000000"/>
+          <w:szCs w:val="21"/>
+        </w:rPr>
+      </w:r>
+      <w:r>
+        <w:rPr>
+          <w:color w:val="000000"/>
+          <w:szCs w:val="21"/>
+        </w:rPr>
+      </w:r>
+      <w:r>
+        <w:rPr>
+          <w:color w:val="000000"/>
+          <w:szCs w:val="21"/>
+        </w:rPr>
+      </w:r>
+      <w:r>
+        <w:rPr>
+          <w:color w:val="000000"/>
+          <w:szCs w:val="21"/>
+        </w:rPr>
+      </w:r>
+      <w:r>
+        <w:rPr>
+          <w:color w:val="000000"/>
+          <w:szCs w:val="21"/>
+        </w:rPr>
+      </w:r>
+      <w:r>
+        <w:rPr>
+          <w:color w:val="000000"/>
+          <w:szCs w:val="21"/>
+        </w:rPr>
+      </w:r>
+      <w:r>
+        <w:rPr>
+          <w:color w:val="000000"/>
+          <w:szCs w:val="21"/>
+        </w:rPr>
+      </w:r>
+      <w:r>
+        <w:rPr>
+          <w:color w:val="000000"/>
+          <w:szCs w:val="21"/>
+        </w:rPr>
+      </w:r>
+      <w:r>
+        <w:rPr>
+          <w:color w:val="000000"/>
+          <w:szCs w:val="21"/>
+        </w:rPr>
+      </w:r>
+      <w:r>
+        <w:rPr>
+          <w:color w:val="000000"/>
+          <w:szCs w:val="21"/>
+        </w:rPr>
+      </w:r>
+      <w:r>
+        <w:rPr>
+          <w:color w:val="000000"/>
+          <w:szCs w:val="21"/>
+        </w:rPr>
+      </w:r>
+      <w:r>
+        <w:rPr>
+          <w:color w:val="000000"/>
+          <w:szCs w:val="21"/>
+        </w:rPr>
+      </w:r>
+      <w:r>
+        <w:rPr>
+          <w:color w:val="000000"/>
+          <w:szCs w:val="21"/>
+        </w:rPr>
+      </w:r>
+      <w:r>
+        <w:rPr>
+          <w:color w:val="000000"/>
+          <w:szCs w:val="21"/>
+        </w:rPr>
+      </w:r>
+      <w:r>
+        <w:rPr>
+          <w:color w:val="000000"/>
+          <w:szCs w:val="21"/>
+        </w:rPr>
+      </w:r>
+      <w:r>
+        <w:rPr>
+          <w:color w:val="000000"/>
+          <w:szCs w:val="21"/>
+        </w:rPr>
+      </w:r>
+      <w:r>
+        <w:rPr>
+          <w:color w:val="000000"/>
+          <w:szCs w:val="21"/>
+        </w:rPr>
+      </w:r>
+      <w:r>
+        <w:rPr>
+          <w:color w:val="000000"/>
+          <w:szCs w:val="21"/>
+        </w:rPr>
+      </w:r>
+      <w:r>
+        <w:rPr>
+          <w:color w:val="000000"/>
+          <w:szCs w:val="21"/>
+        </w:rPr>
+      </w:r>
+      <w:r>
+        <w:rPr>
+          <w:color w:val="000000"/>
+          <w:szCs w:val="21"/>
+        </w:rPr>
+      </w:r>
+      <w:r>
+        <w:rPr>
+          <w:color w:val="000000"/>
+          <w:szCs w:val="21"/>
+        </w:rPr>
+      </w:r>
+      <w:r>
+        <w:rPr>
+          <w:color w:val="000000"/>
+          <w:szCs w:val="21"/>
+        </w:rPr>
+      </w:r>
+      <w:r>
+        <w:rPr>
+          <w:color w:val="000000"/>
+          <w:szCs w:val="21"/>
+        </w:rPr>
+      </w:r>
+      <w:r>
+        <w:rPr>
+          <w:color w:val="000000"/>
+          <w:szCs w:val="21"/>
+        </w:rPr>
+      </w:r>
+      <w:r>
+        <w:rPr>
+          <w:color w:val="000000"/>
+          <w:szCs w:val="21"/>
+        </w:rPr>
+      </w:r>
+      <w:r>
+        <w:rPr>
+          <w:color w:val="000000"/>
+          <w:szCs w:val="21"/>
+        </w:rPr>
+      </w:r>
+      <w:r>
+        <w:rPr>
+          <w:color w:val="000000"/>
+          <w:szCs w:val="21"/>
+        </w:rPr>
+      </w:r>
+      <w:r>
+        <w:rPr>
+          <w:color w:val="000000"/>
+          <w:szCs w:val="21"/>
+        </w:rPr>
+      </w:r>
+      <w:r>
+        <w:rPr>
+          <w:color w:val="000000"/>
+          <w:szCs w:val="21"/>
+        </w:rPr>
+      </w:r>
+      <w:r>
+        <w:rPr>
+          <w:color w:val="000000"/>
+          <w:szCs w:val="21"/>
+        </w:rPr>
+      </w:r>
+      <w:r>
+        <w:rPr>
+          <w:color w:val="000000"/>
+          <w:szCs w:val="21"/>
+        </w:rPr>
+      </w:r>
+      <w:r>
+        <w:rPr>
+          <w:color w:val="000000"/>
+          <w:szCs w:val="21"/>
+        </w:rPr>
+      </w:r>
+      <w:r>
+        <w:rPr>
+          <w:color w:val="000000"/>
+          <w:szCs w:val="21"/>
+        </w:rPr>
+      </w:r>
+      <w:r>
+        <w:rPr>
+          <w:color w:val="000000"/>
+          <w:szCs w:val="21"/>
+        </w:rPr>
+      </w:r>
+      <w:r>
+        <w:rPr>
+          <w:color w:val="000000"/>
+          <w:szCs w:val="21"/>
+        </w:rPr>
+      </w:r>
+      <w:r>
+        <w:rPr>
+          <w:color w:val="000000"/>
+          <w:szCs w:val="21"/>
+        </w:rPr>
+      </w:r>
+      <w:r>
+        <w:rPr>
+          <w:color w:val="000000"/>
+          <w:szCs w:val="21"/>
+        </w:rPr>
+      </w:r>
+      <w:r>
+        <w:rPr>
+          <w:color w:val="000000"/>
+          <w:szCs w:val="21"/>
+        </w:rPr>
+      </w:r>
+      <w:r>
+        <w:rPr>
+          <w:color w:val="000000"/>
+          <w:szCs w:val="21"/>
+        </w:rPr>
       </w:r>
     </w:p>
     <w:p>
@@ -13615,7 +13565,7 @@
         </w:rPr>
         <w:drawing>
           <wp:inline distT="0" distB="0" distL="0" distR="0" wp14:anchorId="3E6F0209" wp14:editId="369FDCB1">
-            <wp:extent cx="5760720" cy="2798106"/>
+            <wp:extent cx="5760720" cy="3852073"/>
             <wp:effectExtent l="0" t="0" r="0" b="9525"/>
             <wp:docPr id="20" name="图片 2" descr="已检查的图像"/>
             <wp:cNvGraphicFramePr>
@@ -13646,7 +13596,7 @@
                   <pic:spPr bwMode="auto">
                     <a:xfrm>
                       <a:off x="0" y="0"/>
-                      <a:ext cx="5760720" cy="2798106"/>
+                      <a:ext cx="5760720" cy="3852073"/>
                     </a:xfrm>
                     <a:prstGeom prst="rect">
                       <a:avLst/>
@@ -13677,7 +13627,7 @@
           <w:sz w:val="18"/>
           <w:szCs w:val="18"/>
         </w:rPr>
-        <w:t>图2 固定等权与自适应权重的八随机种子配对MSE（橙色方形与蓝色圆形分别表示固定等权和自适应权重；绿色连线表示误差降低，红色连线表示误差升高；竖向虚线和点线表示两模型8种子均值）</w:t>
+        <w:t>图2 固定等权与自适应权重的八随机种子配对MSE及配对差值分布</w:t>
       </w:r>
       <w:r>
         <w:rPr>
@@ -13702,6 +13652,19 @@
           <w:sz w:val="18"/>
           <w:szCs w:val="18"/>
         </w:rPr>
+      </w:r>
+    </w:p>
+    <w:p>
+      <w:pPr>
+        <w:spacing w:before="0" w:after="60" w:line="240" w:lineRule="auto"/>
+        <w:jc w:val="left"/>
+      </w:pPr>
+      <w:r>
+        <w:rPr>
+          <w:rFonts w:ascii="Times New Roman" w:hAnsi="Times New Roman" w:eastAsia="宋体"/>
+          <w:sz w:val="15"/>
+        </w:rPr>
+        <w:t>注：a为Abilene，b为GÉANT。上排灰线连接同一随机种子下的固定等权与自适应权重结果，黑色菱形及误差线表示均值±标准差；下排圆点为各随机种子的ΔMSE，半小提琴表示配对差值的核密度分布，黑色圆点及误差线表示平均ΔMSE及其95%置信区间。ΔMSE&gt;0表示自适应权重模型的MSE更低。</w:t>
       </w:r>
     </w:p>
     <w:p>

</xml_diff>

<commit_message>
Move Figure 2 note to body and add candidate research figures
</commit_message>
<xml_diff>
--- a/word_output/2026.09.20v5.docx
+++ b/word_output/2026.09.20v5.docx
@@ -13249,7 +13249,7 @@
           <w:color w:val="000000"/>
           <w:szCs w:val="21"/>
         </w:rPr>
-        <w:t>同种子配对结果及配对差值分布见图2。图2上排保留随机种子42—49的逐一配对MSE，下排以ΔMSE=固定等权−自适应权重表示效应方向。Abilene中，自适应模型在8个种子中的6个取得更低MSE，平均ΔMSE为0.00320，95%置信区间为[-0.00020,0.00660]，配对t检验p=0.061；GÉANT中为7个，平均ΔMSE为0.02094，95%置信区间为[-0.00958,0.05146]，p=0.149。两数据集的平均差值均为正，说明样本级自适应加权在平均意义上降低了MSE；但相对固定等权的95%置信区间均跨越0，因此不能表述为两数据集均达到统计显著。结合表3可见，Abilene上的跨种子波动较小，而GÉANT仍存在更明显的稳定性提升空间。</w:t>
+        <w:t>同种子配对结果及配对差值分布见图2。图2上排灰线连接同一随机种子下固定等权与自适应权重模型的MSE，黑色菱形及误差线表示8个随机种子的均值±标准差；下排以ΔMSE=固定等权−自适应权重表示效应方向，圆点表示各随机种子的配对差值，半小提琴表示差值分布，黑色圆点及误差线表示平均ΔMSE及其95%置信区间，其中ΔMSE&gt;0表示自适应权重模型的MSE更低。Abilene中，自适应模型在8个种子中的6个取得更低MSE，平均ΔMSE为0.00320，95%置信区间为[-0.00020,0.00660]，配对t检验p=0.061；GÉANT中为7个，平均ΔMSE为0.02094，95%置信区间为[-0.00958,0.05146]，p=0.149。两数据集的平均差值均为正，说明样本级自适应加权在平均意义上降低了MSE；但相对固定等权的95%置信区间均跨越0，因此不能表述为两数据集均达到统计显著。结合表3可见，Abilene上的跨种子波动较小，而GÉANT仍存在更明显的稳定性提升空间。</w:t>
       </w:r>
       <w:r>
         <w:rPr>
@@ -13652,19 +13652,6 @@
           <w:sz w:val="18"/>
           <w:szCs w:val="18"/>
         </w:rPr>
-      </w:r>
-    </w:p>
-    <w:p>
-      <w:pPr>
-        <w:spacing w:before="0" w:after="60" w:line="240" w:lineRule="auto"/>
-        <w:jc w:val="left"/>
-      </w:pPr>
-      <w:r>
-        <w:rPr>
-          <w:rFonts w:ascii="Times New Roman" w:hAnsi="Times New Roman" w:eastAsia="宋体"/>
-          <w:sz w:val="15"/>
-        </w:rPr>
-        <w:t>注：a为Abilene，b为GÉANT。上排灰线连接同一随机种子下的固定等权与自适应权重结果，黑色菱形及误差线表示均值±标准差；下排圆点为各随机种子的ΔMSE，半小提琴表示配对差值的核密度分布，黑色圆点及误差线表示平均ΔMSE及其95%置信区间。ΔMSE&gt;0表示自适应权重模型的MSE更低。</w:t>
       </w:r>
     </w:p>
     <w:p>

</xml_diff>

<commit_message>
Insert router weight distribution as Figure 3 in v5
</commit_message>
<xml_diff>
--- a/word_output/2026.09.20v5.docx
+++ b/word_output/2026.09.20v5.docx
@@ -13696,49 +13696,119 @@
           <w:color w:val="000000"/>
           <w:szCs w:val="21"/>
         </w:rPr>
-        <w:t>为观察样本级路由器是否退化为固定平均融合，图</w:t>
-      </w:r>
-      <w:r>
-        <w:rPr>
-          <w:color w:val="000000"/>
-          <w:szCs w:val="21"/>
-        </w:rPr>
-        <w:t>3</w:t>
-      </w:r>
-      <w:r>
-        <w:rPr>
-          <w:color w:val="000000"/>
-          <w:szCs w:val="21"/>
-        </w:rPr>
-        <w:t>固定选取随机种子</w:t>
-      </w:r>
-      <w:r>
-        <w:rPr>
-          <w:color w:val="000000"/>
-          <w:szCs w:val="21"/>
-        </w:rPr>
-        <w:t>42</w:t>
-      </w:r>
-      <w:r>
-        <w:rPr>
-          <w:color w:val="000000"/>
-          <w:szCs w:val="21"/>
-        </w:rPr>
-        <w:t>，并展示两个数据集测试集前</w:t>
-      </w:r>
-      <w:r>
-        <w:rPr>
-          <w:color w:val="000000"/>
-          <w:szCs w:val="21"/>
-        </w:rPr>
-        <w:t>150</w:t>
-      </w:r>
-      <w:r>
-        <w:rPr>
-          <w:color w:val="000000"/>
-          <w:szCs w:val="21"/>
-        </w:rPr>
-        <w:t>个窗口的三尺度权重。该选择规则在两数据集间保持一致，仅用于机制可视化，不参与模型优劣的统计比较。</w:t>
+        <w:t>为从总体统计视角分析样本级路由器对不同时间尺度的权重分配，图3汇总了Abilene和GÉANT数据集在随机种子42—49下全部测试窗口的三尺度路由权重。图中小提琴轮廓表示样本级权重分布，彩色圆点表示各随机种子的平均权重，黑色菱形及误差线表示8个随机种子均值及标准差，灰色虚线为固定等权基准1/3。</w:t>
+      </w:r>
+      <w:r>
+        <w:rPr>
+          <w:color w:val="000000"/>
+          <w:szCs w:val="21"/>
+        </w:rPr>
+      </w:r>
+      <w:r>
+        <w:rPr>
+          <w:color w:val="000000"/>
+          <w:szCs w:val="21"/>
+        </w:rPr>
+      </w:r>
+      <w:r>
+        <w:rPr>
+          <w:color w:val="000000"/>
+          <w:szCs w:val="21"/>
+        </w:rPr>
+      </w:r>
+      <w:r>
+        <w:rPr>
+          <w:color w:val="000000"/>
+          <w:szCs w:val="21"/>
+        </w:rPr>
+      </w:r>
+      <w:r>
+        <w:rPr>
+          <w:color w:val="000000"/>
+          <w:szCs w:val="21"/>
+        </w:rPr>
+      </w:r>
+      <w:r>
+        <w:rPr>
+          <w:color w:val="000000"/>
+          <w:szCs w:val="21"/>
+        </w:rPr>
+      </w:r>
+    </w:p>
+    <w:p>
+      <w:pPr>
+        <w:jc w:val="center"/>
+      </w:pPr>
+      <w:r>
+        <w:drawing>
+          <wp:inline xmlns:a="http://schemas.openxmlformats.org/drawingml/2006/main" xmlns:pic="http://schemas.openxmlformats.org/drawingml/2006/picture">
+            <wp:extent cx="5760720" cy="2566165"/>
+            <wp:docPr id="22" name="Picture 22"/>
+            <wp:cNvGraphicFramePr>
+              <a:graphicFrameLocks noChangeAspect="1"/>
+            </wp:cNvGraphicFramePr>
+            <a:graphic>
+              <a:graphicData uri="http://schemas.openxmlformats.org/drawingml/2006/picture">
+                <pic:pic>
+                  <pic:nvPicPr>
+                    <pic:cNvPr id="0" name="fig3_router_weight_distribution_color.png"/>
+                    <pic:cNvPicPr/>
+                  </pic:nvPicPr>
+                  <pic:blipFill>
+                    <a:blip r:embed="rId13"/>
+                    <a:stretch>
+                      <a:fillRect/>
+                    </a:stretch>
+                  </pic:blipFill>
+                  <pic:spPr>
+                    <a:xfrm>
+                      <a:off x="0" y="0"/>
+                      <a:ext cx="5760720" cy="2566165"/>
+                    </a:xfrm>
+                    <a:prstGeom prst="rect"/>
+                  </pic:spPr>
+                </pic:pic>
+              </a:graphicData>
+            </a:graphic>
+          </wp:inline>
+        </w:drawing>
+      </w:r>
+    </w:p>
+    <w:p>
+      <w:pPr>
+        <w:keepLines/>
+        <w:spacing w:before="60" w:after="80"/>
+        <w:ind w:firstLine="0"/>
+        <w:jc w:val="center"/>
+      </w:pPr>
+      <w:r>
+        <w:rPr>
+          <w:rFonts w:eastAsia="黑体"/>
+          <w:b/>
+          <w:sz w:val="18"/>
+          <w:szCs w:val="18"/>
+        </w:rPr>
+        <w:t>图3 八随机种子下样本级自适应路由权重分布</w:t>
+      </w:r>
+    </w:p>
+    <w:p>
+      <w:pPr/>
+      <w:r>
+        <w:rPr>
+          <w:color w:val="000000"/>
+          <w:szCs w:val="21"/>
+        </w:rPr>
+        <w:t>从图3可以看出，两数据集的三尺度权重均呈非退化分布，并未长期固定在1/3。按8个随机种子的平均权重计算，Abilene的α1、α2和α4分别为0.257、0.319和0.424，GÉANT分别为0.283、0.318和0.399；两个数据集上尺度4的平均权重均最高，尺度1最低，尺度2整体接近等权基准。与此同时，不同随机种子的平均权重仍存在明显差异，其中Abilene的尺度2和尺度4离散程度更大。该结果说明路由器并非学习到单一固定尺度，而是在总体尺度偏好基础上保留了随训练初始化和输入样本变化的自适应调节能力。</w:t>
+      </w:r>
+    </w:p>
+    <w:p>
+      <w:pPr/>
+      <w:r>
+        <w:rPr>
+          <w:color w:val="000000"/>
+          <w:szCs w:val="21"/>
+        </w:rPr>
+        <w:t>为进一步观察权重在具体测试样本上的动态变化，图4固定选取随机种子42，展示两个数据集测试集前150个窗口的三尺度权重。该选择规则在两数据集间保持一致，仅用于机制可视化，不参与模型优劣的统计比较。</w:t>
       </w:r>
     </w:p>
     <w:p>
@@ -13816,7 +13886,7 @@
           <w:sz w:val="18"/>
           <w:szCs w:val="18"/>
         </w:rPr>
-        <w:t>图3 两数据集样本级路由权重变化（随机种子42，灰色点线为等权基准1/3）</w:t>
+        <w:t>图4 两数据集样本级路由权重变化（随机种子42，灰色点线为等权基准1/3）</w:t>
       </w:r>
       <w:r>
         <w:rPr>
@@ -13857,49 +13927,43 @@
           <w:color w:val="000000"/>
           <w:szCs w:val="21"/>
         </w:rPr>
-        <w:t>图</w:t>
-      </w:r>
-      <w:r>
-        <w:rPr>
-          <w:color w:val="000000"/>
-          <w:szCs w:val="21"/>
-        </w:rPr>
-        <w:t>3</w:t>
-      </w:r>
-      <w:r>
-        <w:rPr>
-          <w:color w:val="000000"/>
-          <w:szCs w:val="21"/>
-        </w:rPr>
-        <w:t>中三个尺度权重均随测试窗口发生变化，并未长期固定在</w:t>
-      </w:r>
-      <w:r>
-        <w:rPr>
-          <w:color w:val="000000"/>
-          <w:szCs w:val="21"/>
-        </w:rPr>
-        <w:t>1/3</w:t>
-      </w:r>
-      <w:r>
-        <w:rPr>
-          <w:color w:val="000000"/>
-          <w:szCs w:val="21"/>
-        </w:rPr>
-        <w:t>附近，说明路由器能够依据输入窗口统计状态动态调整尺度组合。以随机种子</w:t>
-      </w:r>
-      <w:r>
-        <w:rPr>
-          <w:color w:val="000000"/>
-          <w:szCs w:val="21"/>
-        </w:rPr>
-        <w:t>42</w:t>
-      </w:r>
-      <w:r>
-        <w:rPr>
-          <w:color w:val="000000"/>
-          <w:szCs w:val="21"/>
-        </w:rPr>
-        <w:t>为例，两数据集均表现出较明显的尺度偏好变化；但不同随机种子的平均权重并不完全一致，因此不能将某一尺度解释为所有网络场景下持续占优的固定尺度。</w:t>
+        <w:t>图4中三个尺度权重均随测试窗口发生变化，并未长期固定在1/3附近，与图3的总体分布结果相互印证，说明路由器能够依据输入窗口统计状态动态调整尺度组合。以随机种子42为例，两数据集均表现出较明显的尺度偏好变化；但不同随机种子的平均权重并不完全一致，因此不能将某一尺度解释为所有网络场景下持续占优的固定尺度。</w:t>
+      </w:r>
+      <w:r>
+        <w:rPr>
+          <w:color w:val="000000"/>
+          <w:szCs w:val="21"/>
+        </w:rPr>
+      </w:r>
+      <w:r>
+        <w:rPr>
+          <w:color w:val="000000"/>
+          <w:szCs w:val="21"/>
+        </w:rPr>
+      </w:r>
+      <w:r>
+        <w:rPr>
+          <w:color w:val="000000"/>
+          <w:szCs w:val="21"/>
+        </w:rPr>
+      </w:r>
+      <w:r>
+        <w:rPr>
+          <w:color w:val="000000"/>
+          <w:szCs w:val="21"/>
+        </w:rPr>
+      </w:r>
+      <w:r>
+        <w:rPr>
+          <w:color w:val="000000"/>
+          <w:szCs w:val="21"/>
+        </w:rPr>
+      </w:r>
+      <w:r>
+        <w:rPr>
+          <w:color w:val="000000"/>
+          <w:szCs w:val="21"/>
+        </w:rPr>
       </w:r>
     </w:p>
     <w:p>
@@ -13908,161 +13972,139 @@
           <w:color w:val="000000"/>
           <w:szCs w:val="21"/>
         </w:rPr>
-        <w:t>综合表</w:t>
-      </w:r>
-      <w:r>
-        <w:rPr>
-          <w:color w:val="000000"/>
-          <w:szCs w:val="21"/>
-        </w:rPr>
-        <w:t>2</w:t>
-      </w:r>
-      <w:r>
-        <w:rPr>
-          <w:color w:val="000000"/>
-          <w:szCs w:val="21"/>
-        </w:rPr>
-        <w:t>、表</w:t>
-      </w:r>
-      <w:r>
-        <w:rPr>
-          <w:color w:val="000000"/>
-          <w:szCs w:val="21"/>
-        </w:rPr>
-        <w:t>3</w:t>
-      </w:r>
-      <w:r>
-        <w:rPr>
-          <w:color w:val="000000"/>
-          <w:szCs w:val="21"/>
-        </w:rPr>
-        <w:t>和图</w:t>
-      </w:r>
-      <w:r>
-        <w:rPr>
-          <w:color w:val="000000"/>
-          <w:szCs w:val="21"/>
-        </w:rPr>
-        <w:t>2</w:t>
-      </w:r>
-      <w:r>
-        <w:rPr>
-          <w:color w:val="000000"/>
-          <w:szCs w:val="21"/>
-        </w:rPr>
-        <w:t>可见，样本级自适应尺度加权的平均收益已在</w:t>
-      </w:r>
-      <w:r>
-        <w:rPr>
-          <w:color w:val="000000"/>
-          <w:szCs w:val="21"/>
-        </w:rPr>
-        <w:t>Abilene</w:t>
-      </w:r>
-      <w:r>
-        <w:rPr>
-          <w:color w:val="000000"/>
-          <w:szCs w:val="21"/>
-        </w:rPr>
-        <w:t>和</w:t>
-      </w:r>
-      <w:r>
-        <w:rPr>
-          <w:color w:val="000000"/>
-          <w:szCs w:val="21"/>
-        </w:rPr>
-        <w:t>GÉANT</w:t>
-      </w:r>
-      <w:r>
-        <w:rPr>
-          <w:color w:val="000000"/>
-          <w:szCs w:val="21"/>
-        </w:rPr>
-        <w:t>两个骨干网数据集上得到验证，但</w:t>
-      </w:r>
-      <w:r>
-        <w:rPr>
-          <w:color w:val="000000"/>
-          <w:szCs w:val="21"/>
-        </w:rPr>
-        <w:t>GÉANT</w:t>
-      </w:r>
-      <w:r>
-        <w:rPr>
-          <w:color w:val="000000"/>
-          <w:szCs w:val="21"/>
-        </w:rPr>
-        <w:t>上的跨种子方差更大，稳定性仍有提升空间。当前实验仅考察</w:t>
-      </w:r>
-      <w:r>
-        <w:rPr>
-          <w:color w:val="000000"/>
-          <w:szCs w:val="21"/>
-        </w:rPr>
-        <w:t>L=96</w:t>
-      </w:r>
-      <w:r>
-        <w:rPr>
-          <w:color w:val="000000"/>
-          <w:szCs w:val="21"/>
-        </w:rPr>
-        <w:t>、</w:t>
-      </w:r>
-      <w:r>
-        <w:rPr>
-          <w:color w:val="000000"/>
-          <w:szCs w:val="21"/>
-        </w:rPr>
-        <w:t>H=24</w:t>
-      </w:r>
-      <w:r>
-        <w:rPr>
-          <w:color w:val="000000"/>
-          <w:szCs w:val="21"/>
-        </w:rPr>
-        <w:t>的单一预测设置，未显式建模网络拓扑，外部模型也仅包含</w:t>
-      </w:r>
-      <w:r>
-        <w:rPr>
-          <w:color w:val="000000"/>
-          <w:szCs w:val="21"/>
-        </w:rPr>
-        <w:t>LightTS</w:t>
-      </w:r>
-      <w:r>
-        <w:rPr>
-          <w:color w:val="000000"/>
-          <w:szCs w:val="21"/>
-        </w:rPr>
-        <w:t>一种轻量基线；同时，本文</w:t>
-      </w:r>
-      <w:r>
-        <w:rPr>
-          <w:color w:val="000000"/>
-          <w:szCs w:val="21"/>
-        </w:rPr>
-        <w:t>“</w:t>
-      </w:r>
-      <w:r>
-        <w:rPr>
-          <w:color w:val="000000"/>
-          <w:szCs w:val="21"/>
-        </w:rPr>
-        <w:t>轻量</w:t>
-      </w:r>
-      <w:r>
-        <w:rPr>
-          <w:color w:val="000000"/>
-          <w:szCs w:val="21"/>
-        </w:rPr>
-        <w:t>”</w:t>
-      </w:r>
-      <w:r>
-        <w:rPr>
-          <w:color w:val="000000"/>
-          <w:szCs w:val="21"/>
-        </w:rPr>
-        <w:t>主要指参数规模，而非训练时间最短。因此，后续仍需在更多网络、预测长度和拓扑约束条件下进一步检验泛化性。</w:t>
+        <w:t>综合表2、表3和图2—图4可见，样本级自适应尺度加权的平均收益已在Abilene和GÉANT两个骨干网数据集上得到验证，路由权重的总体分布与局部动态也表明模型确实在不同时间尺度之间进行自适应调节；但GÉANT上的跨种子方差更大，稳定性仍有提升空间。当前实验仅考察L=96、H=24的单一预测设置，未显式建模网络拓扑，外部模型也仅包含LightTS一种轻量基线；同时，“轻量”主要指参数规模，而非训练时间最短。因此，后续仍需在更多网络、预测长度和拓扑约束条件下进一步检验泛化性。</w:t>
+      </w:r>
+      <w:r>
+        <w:rPr>
+          <w:color w:val="000000"/>
+          <w:szCs w:val="21"/>
+        </w:rPr>
+      </w:r>
+      <w:r>
+        <w:rPr>
+          <w:color w:val="000000"/>
+          <w:szCs w:val="21"/>
+        </w:rPr>
+      </w:r>
+      <w:r>
+        <w:rPr>
+          <w:color w:val="000000"/>
+          <w:szCs w:val="21"/>
+        </w:rPr>
+      </w:r>
+      <w:r>
+        <w:rPr>
+          <w:color w:val="000000"/>
+          <w:szCs w:val="21"/>
+        </w:rPr>
+      </w:r>
+      <w:r>
+        <w:rPr>
+          <w:color w:val="000000"/>
+          <w:szCs w:val="21"/>
+        </w:rPr>
+      </w:r>
+      <w:r>
+        <w:rPr>
+          <w:color w:val="000000"/>
+          <w:szCs w:val="21"/>
+        </w:rPr>
+      </w:r>
+      <w:r>
+        <w:rPr>
+          <w:color w:val="000000"/>
+          <w:szCs w:val="21"/>
+        </w:rPr>
+      </w:r>
+      <w:r>
+        <w:rPr>
+          <w:color w:val="000000"/>
+          <w:szCs w:val="21"/>
+        </w:rPr>
+      </w:r>
+      <w:r>
+        <w:rPr>
+          <w:color w:val="000000"/>
+          <w:szCs w:val="21"/>
+        </w:rPr>
+      </w:r>
+      <w:r>
+        <w:rPr>
+          <w:color w:val="000000"/>
+          <w:szCs w:val="21"/>
+        </w:rPr>
+      </w:r>
+      <w:r>
+        <w:rPr>
+          <w:color w:val="000000"/>
+          <w:szCs w:val="21"/>
+        </w:rPr>
+      </w:r>
+      <w:r>
+        <w:rPr>
+          <w:color w:val="000000"/>
+          <w:szCs w:val="21"/>
+        </w:rPr>
+      </w:r>
+      <w:r>
+        <w:rPr>
+          <w:color w:val="000000"/>
+          <w:szCs w:val="21"/>
+        </w:rPr>
+      </w:r>
+      <w:r>
+        <w:rPr>
+          <w:color w:val="000000"/>
+          <w:szCs w:val="21"/>
+        </w:rPr>
+      </w:r>
+      <w:r>
+        <w:rPr>
+          <w:color w:val="000000"/>
+          <w:szCs w:val="21"/>
+        </w:rPr>
+      </w:r>
+      <w:r>
+        <w:rPr>
+          <w:color w:val="000000"/>
+          <w:szCs w:val="21"/>
+        </w:rPr>
+      </w:r>
+      <w:r>
+        <w:rPr>
+          <w:color w:val="000000"/>
+          <w:szCs w:val="21"/>
+        </w:rPr>
+      </w:r>
+      <w:r>
+        <w:rPr>
+          <w:color w:val="000000"/>
+          <w:szCs w:val="21"/>
+        </w:rPr>
+      </w:r>
+      <w:r>
+        <w:rPr>
+          <w:color w:val="000000"/>
+          <w:szCs w:val="21"/>
+        </w:rPr>
+      </w:r>
+      <w:r>
+        <w:rPr>
+          <w:color w:val="000000"/>
+          <w:szCs w:val="21"/>
+        </w:rPr>
+      </w:r>
+      <w:r>
+        <w:rPr>
+          <w:color w:val="000000"/>
+          <w:szCs w:val="21"/>
+        </w:rPr>
+      </w:r>
+      <w:r>
+        <w:rPr>
+          <w:color w:val="000000"/>
+          <w:szCs w:val="21"/>
+        </w:rPr>
       </w:r>
     </w:p>
     <w:p>

</xml_diff>